<commit_message>
update SRS và paper
</commit_message>
<xml_diff>
--- a/VietTicket_Travel_SWR302_Report_Scopus4.docx
+++ b/VietTicket_Travel_SWR302_Report_Scopus4.docx
@@ -115,25 +115,17 @@
         <w:tabs>
           <w:tab w:pos="9072" w:val="right" w:leader="dot"/>
         </w:tabs>
-        <w:spacing w:after="40"/>
+        <w:spacing w:after="0"/>
         <w:ind w:left="0" w:firstLine="0"/>
       </w:pPr>
       <w:r>
         <w:rPr>
-          <w:rFonts w:ascii="Times New Roman" w:hAnsi="Times New Roman" w:eastAsia="Times New Roman"/>
+          <w:rFonts w:ascii="Times New Roman" w:hAnsi="Times New Roman"/>
           <w:b/>
           <w:sz w:val="22"/>
         </w:rPr>
         <w:t>Abstract</w:t>
-      </w:r>
-      <w:r>
         <w:tab/>
-      </w:r>
-      <w:r>
-        <w:rPr>
-          <w:rFonts w:ascii="Times New Roman" w:hAnsi="Times New Roman" w:eastAsia="Times New Roman"/>
-          <w:sz w:val="22"/>
-        </w:rPr>
         <w:t>3</w:t>
       </w:r>
     </w:p>
@@ -142,25 +134,17 @@
         <w:tabs>
           <w:tab w:pos="9072" w:val="right" w:leader="dot"/>
         </w:tabs>
-        <w:spacing w:after="40"/>
+        <w:spacing w:after="0"/>
         <w:ind w:left="0" w:firstLine="0"/>
       </w:pPr>
       <w:r>
         <w:rPr>
-          <w:rFonts w:ascii="Times New Roman" w:hAnsi="Times New Roman" w:eastAsia="Times New Roman"/>
+          <w:rFonts w:ascii="Times New Roman" w:hAnsi="Times New Roman"/>
           <w:b/>
           <w:sz w:val="22"/>
         </w:rPr>
         <w:t>1. Introduction</w:t>
-      </w:r>
-      <w:r>
         <w:tab/>
-      </w:r>
-      <w:r>
-        <w:rPr>
-          <w:rFonts w:ascii="Times New Roman" w:hAnsi="Times New Roman" w:eastAsia="Times New Roman"/>
-          <w:sz w:val="22"/>
-        </w:rPr>
         <w:t>3</w:t>
       </w:r>
     </w:p>
@@ -169,25 +153,17 @@
         <w:tabs>
           <w:tab w:pos="9072" w:val="right" w:leader="dot"/>
         </w:tabs>
-        <w:spacing w:after="40"/>
+        <w:spacing w:after="0"/>
         <w:ind w:left="360" w:firstLine="0"/>
       </w:pPr>
       <w:r>
         <w:rPr>
-          <w:rFonts w:ascii="Times New Roman" w:hAnsi="Times New Roman" w:eastAsia="Times New Roman"/>
+          <w:rFonts w:ascii="Times New Roman" w:hAnsi="Times New Roman"/>
           <w:b w:val="0"/>
           <w:sz w:val="22"/>
         </w:rPr>
         <w:t>1.1 Research Background</w:t>
-      </w:r>
-      <w:r>
         <w:tab/>
-      </w:r>
-      <w:r>
-        <w:rPr>
-          <w:rFonts w:ascii="Times New Roman" w:hAnsi="Times New Roman" w:eastAsia="Times New Roman"/>
-          <w:sz w:val="22"/>
-        </w:rPr>
         <w:t>3</w:t>
       </w:r>
     </w:p>
@@ -196,25 +172,17 @@
         <w:tabs>
           <w:tab w:pos="9072" w:val="right" w:leader="dot"/>
         </w:tabs>
-        <w:spacing w:after="40"/>
+        <w:spacing w:after="0"/>
         <w:ind w:left="360" w:firstLine="0"/>
       </w:pPr>
       <w:r>
         <w:rPr>
-          <w:rFonts w:ascii="Times New Roman" w:hAnsi="Times New Roman" w:eastAsia="Times New Roman"/>
+          <w:rFonts w:ascii="Times New Roman" w:hAnsi="Times New Roman"/>
           <w:b w:val="0"/>
           <w:sz w:val="22"/>
         </w:rPr>
         <w:t>1.2 Problem Statement</w:t>
-      </w:r>
-      <w:r>
         <w:tab/>
-      </w:r>
-      <w:r>
-        <w:rPr>
-          <w:rFonts w:ascii="Times New Roman" w:hAnsi="Times New Roman" w:eastAsia="Times New Roman"/>
-          <w:sz w:val="22"/>
-        </w:rPr>
         <w:t>3</w:t>
       </w:r>
     </w:p>
@@ -223,25 +191,17 @@
         <w:tabs>
           <w:tab w:pos="9072" w:val="right" w:leader="dot"/>
         </w:tabs>
-        <w:spacing w:after="40"/>
+        <w:spacing w:after="0"/>
         <w:ind w:left="360" w:firstLine="0"/>
       </w:pPr>
       <w:r>
         <w:rPr>
-          <w:rFonts w:ascii="Times New Roman" w:hAnsi="Times New Roman" w:eastAsia="Times New Roman"/>
+          <w:rFonts w:ascii="Times New Roman" w:hAnsi="Times New Roman"/>
           <w:b w:val="0"/>
           <w:sz w:val="22"/>
         </w:rPr>
         <w:t>1.3 Research Objectives</w:t>
-      </w:r>
-      <w:r>
         <w:tab/>
-      </w:r>
-      <w:r>
-        <w:rPr>
-          <w:rFonts w:ascii="Times New Roman" w:hAnsi="Times New Roman" w:eastAsia="Times New Roman"/>
-          <w:sz w:val="22"/>
-        </w:rPr>
         <w:t>4</w:t>
       </w:r>
     </w:p>
@@ -250,25 +210,17 @@
         <w:tabs>
           <w:tab w:pos="9072" w:val="right" w:leader="dot"/>
         </w:tabs>
-        <w:spacing w:after="40"/>
+        <w:spacing w:after="0"/>
         <w:ind w:left="360" w:firstLine="0"/>
       </w:pPr>
       <w:r>
         <w:rPr>
-          <w:rFonts w:ascii="Times New Roman" w:hAnsi="Times New Roman" w:eastAsia="Times New Roman"/>
+          <w:rFonts w:ascii="Times New Roman" w:hAnsi="Times New Roman"/>
           <w:b w:val="0"/>
           <w:sz w:val="22"/>
         </w:rPr>
         <w:t>1.4 Research Contributions</w:t>
-      </w:r>
-      <w:r>
         <w:tab/>
-      </w:r>
-      <w:r>
-        <w:rPr>
-          <w:rFonts w:ascii="Times New Roman" w:hAnsi="Times New Roman" w:eastAsia="Times New Roman"/>
-          <w:sz w:val="22"/>
-        </w:rPr>
         <w:t>4</w:t>
       </w:r>
     </w:p>
@@ -277,25 +229,17 @@
         <w:tabs>
           <w:tab w:pos="9072" w:val="right" w:leader="dot"/>
         </w:tabs>
-        <w:spacing w:after="40"/>
+        <w:spacing w:after="0"/>
         <w:ind w:left="360" w:firstLine="0"/>
       </w:pPr>
       <w:r>
         <w:rPr>
-          <w:rFonts w:ascii="Times New Roman" w:hAnsi="Times New Roman" w:eastAsia="Times New Roman"/>
+          <w:rFonts w:ascii="Times New Roman" w:hAnsi="Times New Roman"/>
           <w:b w:val="0"/>
           <w:sz w:val="22"/>
         </w:rPr>
         <w:t>1.5 Paper Structure</w:t>
-      </w:r>
-      <w:r>
         <w:tab/>
-      </w:r>
-      <w:r>
-        <w:rPr>
-          <w:rFonts w:ascii="Times New Roman" w:hAnsi="Times New Roman" w:eastAsia="Times New Roman"/>
-          <w:sz w:val="22"/>
-        </w:rPr>
         <w:t>4</w:t>
       </w:r>
     </w:p>
@@ -304,25 +248,17 @@
         <w:tabs>
           <w:tab w:pos="9072" w:val="right" w:leader="dot"/>
         </w:tabs>
-        <w:spacing w:after="40"/>
+        <w:spacing w:after="0"/>
         <w:ind w:left="0" w:firstLine="0"/>
       </w:pPr>
       <w:r>
         <w:rPr>
-          <w:rFonts w:ascii="Times New Roman" w:hAnsi="Times New Roman" w:eastAsia="Times New Roman"/>
+          <w:rFonts w:ascii="Times New Roman" w:hAnsi="Times New Roman"/>
           <w:b/>
           <w:sz w:val="22"/>
         </w:rPr>
         <w:t>2. Related Work</w:t>
-      </w:r>
-      <w:r>
         <w:tab/>
-      </w:r>
-      <w:r>
-        <w:rPr>
-          <w:rFonts w:ascii="Times New Roman" w:hAnsi="Times New Roman" w:eastAsia="Times New Roman"/>
-          <w:sz w:val="22"/>
-        </w:rPr>
         <w:t>5</w:t>
       </w:r>
     </w:p>
@@ -331,25 +267,17 @@
         <w:tabs>
           <w:tab w:pos="9072" w:val="right" w:leader="dot"/>
         </w:tabs>
-        <w:spacing w:after="40"/>
+        <w:spacing w:after="0"/>
         <w:ind w:left="360" w:firstLine="0"/>
       </w:pPr>
       <w:r>
         <w:rPr>
-          <w:rFonts w:ascii="Times New Roman" w:hAnsi="Times New Roman" w:eastAsia="Times New Roman"/>
+          <w:rFonts w:ascii="Times New Roman" w:hAnsi="Times New Roman"/>
           <w:b w:val="0"/>
           <w:sz w:val="22"/>
         </w:rPr>
         <w:t>2.1 Smart Tourism and e-Tourism Platforms</w:t>
-      </w:r>
-      <w:r>
         <w:tab/>
-      </w:r>
-      <w:r>
-        <w:rPr>
-          <w:rFonts w:ascii="Times New Roman" w:hAnsi="Times New Roman" w:eastAsia="Times New Roman"/>
-          <w:sz w:val="22"/>
-        </w:rPr>
         <w:t>5</w:t>
       </w:r>
     </w:p>
@@ -358,25 +286,17 @@
         <w:tabs>
           <w:tab w:pos="9072" w:val="right" w:leader="dot"/>
         </w:tabs>
-        <w:spacing w:after="40"/>
+        <w:spacing w:after="0"/>
         <w:ind w:left="360" w:firstLine="0"/>
       </w:pPr>
       <w:r>
         <w:rPr>
-          <w:rFonts w:ascii="Times New Roman" w:hAnsi="Times New Roman" w:eastAsia="Times New Roman"/>
+          <w:rFonts w:ascii="Times New Roman" w:hAnsi="Times New Roman"/>
           <w:b w:val="0"/>
           <w:sz w:val="22"/>
         </w:rPr>
         <w:t>2.2 Tourism Recommender Systems and Point-of-Interest Recommendation</w:t>
-      </w:r>
-      <w:r>
         <w:tab/>
-      </w:r>
-      <w:r>
-        <w:rPr>
-          <w:rFonts w:ascii="Times New Roman" w:hAnsi="Times New Roman" w:eastAsia="Times New Roman"/>
-          <w:sz w:val="22"/>
-        </w:rPr>
         <w:t>5</w:t>
       </w:r>
     </w:p>
@@ -385,25 +305,17 @@
         <w:tabs>
           <w:tab w:pos="9072" w:val="right" w:leader="dot"/>
         </w:tabs>
-        <w:spacing w:after="40"/>
+        <w:spacing w:after="0"/>
         <w:ind w:left="360" w:firstLine="0"/>
       </w:pPr>
       <w:r>
         <w:rPr>
-          <w:rFonts w:ascii="Times New Roman" w:hAnsi="Times New Roman" w:eastAsia="Times New Roman"/>
+          <w:rFonts w:ascii="Times New Roman" w:hAnsi="Times New Roman"/>
           <w:b w:val="0"/>
           <w:sz w:val="22"/>
         </w:rPr>
         <w:t>2.3 Online Booking Trust and Travel Information Quality</w:t>
-      </w:r>
-      <w:r>
         <w:tab/>
-      </w:r>
-      <w:r>
-        <w:rPr>
-          <w:rFonts w:ascii="Times New Roman" w:hAnsi="Times New Roman" w:eastAsia="Times New Roman"/>
-          <w:sz w:val="22"/>
-        </w:rPr>
         <w:t>5</w:t>
       </w:r>
     </w:p>
@@ -412,25 +324,17 @@
         <w:tabs>
           <w:tab w:pos="9072" w:val="right" w:leader="dot"/>
         </w:tabs>
-        <w:spacing w:after="40"/>
+        <w:spacing w:after="0"/>
         <w:ind w:left="360" w:firstLine="0"/>
       </w:pPr>
       <w:r>
         <w:rPr>
-          <w:rFonts w:ascii="Times New Roman" w:hAnsi="Times New Roman" w:eastAsia="Times New Roman"/>
+          <w:rFonts w:ascii="Times New Roman" w:hAnsi="Times New Roman"/>
           <w:b w:val="0"/>
           <w:sz w:val="22"/>
         </w:rPr>
         <w:t>2.4 Payment Methods in Hospitality and Tourism</w:t>
-      </w:r>
-      <w:r>
         <w:tab/>
-      </w:r>
-      <w:r>
-        <w:rPr>
-          <w:rFonts w:ascii="Times New Roman" w:hAnsi="Times New Roman" w:eastAsia="Times New Roman"/>
-          <w:sz w:val="22"/>
-        </w:rPr>
         <w:t>6</w:t>
       </w:r>
     </w:p>
@@ -439,25 +343,17 @@
         <w:tabs>
           <w:tab w:pos="9072" w:val="right" w:leader="dot"/>
         </w:tabs>
-        <w:spacing w:after="40"/>
+        <w:spacing w:after="0"/>
         <w:ind w:left="360" w:firstLine="0"/>
       </w:pPr>
       <w:r>
         <w:rPr>
-          <w:rFonts w:ascii="Times New Roman" w:hAnsi="Times New Roman" w:eastAsia="Times New Roman"/>
+          <w:rFonts w:ascii="Times New Roman" w:hAnsi="Times New Roman"/>
           <w:b w:val="0"/>
           <w:sz w:val="22"/>
         </w:rPr>
         <w:t>2.5 Digital Content and Future Experience Enhancement</w:t>
-      </w:r>
-      <w:r>
         <w:tab/>
-      </w:r>
-      <w:r>
-        <w:rPr>
-          <w:rFonts w:ascii="Times New Roman" w:hAnsi="Times New Roman" w:eastAsia="Times New Roman"/>
-          <w:sz w:val="22"/>
-        </w:rPr>
         <w:t>6</w:t>
       </w:r>
     </w:p>
@@ -466,25 +362,17 @@
         <w:tabs>
           <w:tab w:pos="9072" w:val="right" w:leader="dot"/>
         </w:tabs>
-        <w:spacing w:after="40"/>
+        <w:spacing w:after="0"/>
         <w:ind w:left="0" w:firstLine="0"/>
       </w:pPr>
       <w:r>
         <w:rPr>
-          <w:rFonts w:ascii="Times New Roman" w:hAnsi="Times New Roman" w:eastAsia="Times New Roman"/>
+          <w:rFonts w:ascii="Times New Roman" w:hAnsi="Times New Roman"/>
           <w:b/>
           <w:sz w:val="22"/>
         </w:rPr>
         <w:t>3. Methodology and System Design</w:t>
-      </w:r>
-      <w:r>
         <w:tab/>
-      </w:r>
-      <w:r>
-        <w:rPr>
-          <w:rFonts w:ascii="Times New Roman" w:hAnsi="Times New Roman" w:eastAsia="Times New Roman"/>
-          <w:sz w:val="22"/>
-        </w:rPr>
         <w:t>6</w:t>
       </w:r>
     </w:p>
@@ -493,25 +381,17 @@
         <w:tabs>
           <w:tab w:pos="9072" w:val="right" w:leader="dot"/>
         </w:tabs>
-        <w:spacing w:after="40"/>
+        <w:spacing w:after="0"/>
         <w:ind w:left="360" w:firstLine="0"/>
       </w:pPr>
       <w:r>
         <w:rPr>
-          <w:rFonts w:ascii="Times New Roman" w:hAnsi="Times New Roman" w:eastAsia="Times New Roman"/>
+          <w:rFonts w:ascii="Times New Roman" w:hAnsi="Times New Roman"/>
           <w:b w:val="0"/>
           <w:sz w:val="22"/>
         </w:rPr>
         <w:t>3.1 Requirement Engineering Approach</w:t>
-      </w:r>
-      <w:r>
         <w:tab/>
-      </w:r>
-      <w:r>
-        <w:rPr>
-          <w:rFonts w:ascii="Times New Roman" w:hAnsi="Times New Roman" w:eastAsia="Times New Roman"/>
-          <w:sz w:val="22"/>
-        </w:rPr>
         <w:t>6</w:t>
       </w:r>
     </w:p>
@@ -520,25 +400,17 @@
         <w:tabs>
           <w:tab w:pos="9072" w:val="right" w:leader="dot"/>
         </w:tabs>
-        <w:spacing w:after="40"/>
+        <w:spacing w:after="0"/>
         <w:ind w:left="360" w:firstLine="0"/>
       </w:pPr>
       <w:r>
         <w:rPr>
-          <w:rFonts w:ascii="Times New Roman" w:hAnsi="Times New Roman" w:eastAsia="Times New Roman"/>
+          <w:rFonts w:ascii="Times New Roman" w:hAnsi="Times New Roman"/>
           <w:b w:val="0"/>
           <w:sz w:val="22"/>
         </w:rPr>
         <w:t>3.2 Overall Architecture</w:t>
-      </w:r>
-      <w:r>
         <w:tab/>
-      </w:r>
-      <w:r>
-        <w:rPr>
-          <w:rFonts w:ascii="Times New Roman" w:hAnsi="Times New Roman" w:eastAsia="Times New Roman"/>
-          <w:sz w:val="22"/>
-        </w:rPr>
         <w:t>6</w:t>
       </w:r>
     </w:p>
@@ -547,25 +419,17 @@
         <w:tabs>
           <w:tab w:pos="9072" w:val="right" w:leader="dot"/>
         </w:tabs>
-        <w:spacing w:after="40"/>
+        <w:spacing w:after="0"/>
         <w:ind w:left="720" w:firstLine="0"/>
       </w:pPr>
       <w:r>
         <w:rPr>
-          <w:rFonts w:ascii="Times New Roman" w:hAnsi="Times New Roman" w:eastAsia="Times New Roman"/>
+          <w:rFonts w:ascii="Times New Roman" w:hAnsi="Times New Roman"/>
           <w:b w:val="0"/>
           <w:sz w:val="20"/>
         </w:rPr>
         <w:t>3.2.1 Presentation Layer</w:t>
-      </w:r>
-      <w:r>
         <w:tab/>
-      </w:r>
-      <w:r>
-        <w:rPr>
-          <w:rFonts w:ascii="Times New Roman" w:hAnsi="Times New Roman" w:eastAsia="Times New Roman"/>
-          <w:sz w:val="20"/>
-        </w:rPr>
         <w:t>7</w:t>
       </w:r>
     </w:p>
@@ -574,25 +438,17 @@
         <w:tabs>
           <w:tab w:pos="9072" w:val="right" w:leader="dot"/>
         </w:tabs>
-        <w:spacing w:after="40"/>
+        <w:spacing w:after="0"/>
         <w:ind w:left="720" w:firstLine="0"/>
       </w:pPr>
       <w:r>
         <w:rPr>
-          <w:rFonts w:ascii="Times New Roman" w:hAnsi="Times New Roman" w:eastAsia="Times New Roman"/>
+          <w:rFonts w:ascii="Times New Roman" w:hAnsi="Times New Roman"/>
           <w:b w:val="0"/>
           <w:sz w:val="20"/>
         </w:rPr>
         <w:t>3.2.2 Backend API Layer</w:t>
-      </w:r>
-      <w:r>
         <w:tab/>
-      </w:r>
-      <w:r>
-        <w:rPr>
-          <w:rFonts w:ascii="Times New Roman" w:hAnsi="Times New Roman" w:eastAsia="Times New Roman"/>
-          <w:sz w:val="20"/>
-        </w:rPr>
         <w:t>7</w:t>
       </w:r>
     </w:p>
@@ -601,25 +457,17 @@
         <w:tabs>
           <w:tab w:pos="9072" w:val="right" w:leader="dot"/>
         </w:tabs>
-        <w:spacing w:after="40"/>
+        <w:spacing w:after="0"/>
         <w:ind w:left="720" w:firstLine="0"/>
       </w:pPr>
       <w:r>
         <w:rPr>
-          <w:rFonts w:ascii="Times New Roman" w:hAnsi="Times New Roman" w:eastAsia="Times New Roman"/>
+          <w:rFonts w:ascii="Times New Roman" w:hAnsi="Times New Roman"/>
           <w:b w:val="0"/>
           <w:sz w:val="20"/>
         </w:rPr>
         <w:t>3.2.3 Database and External Integration Layer</w:t>
-      </w:r>
-      <w:r>
         <w:tab/>
-      </w:r>
-      <w:r>
-        <w:rPr>
-          <w:rFonts w:ascii="Times New Roman" w:hAnsi="Times New Roman" w:eastAsia="Times New Roman"/>
-          <w:sz w:val="20"/>
-        </w:rPr>
         <w:t>7</w:t>
       </w:r>
     </w:p>
@@ -628,25 +476,17 @@
         <w:tabs>
           <w:tab w:pos="9072" w:val="right" w:leader="dot"/>
         </w:tabs>
-        <w:spacing w:after="40"/>
+        <w:spacing w:after="0"/>
         <w:ind w:left="360" w:firstLine="0"/>
       </w:pPr>
       <w:r>
         <w:rPr>
-          <w:rFonts w:ascii="Times New Roman" w:hAnsi="Times New Roman" w:eastAsia="Times New Roman"/>
+          <w:rFonts w:ascii="Times New Roman" w:hAnsi="Times New Roman"/>
           <w:b w:val="0"/>
           <w:sz w:val="22"/>
         </w:rPr>
         <w:t>3.3 Actors and Access Control</w:t>
-      </w:r>
-      <w:r>
         <w:tab/>
-      </w:r>
-      <w:r>
-        <w:rPr>
-          <w:rFonts w:ascii="Times New Roman" w:hAnsi="Times New Roman" w:eastAsia="Times New Roman"/>
-          <w:sz w:val="22"/>
-        </w:rPr>
         <w:t>7</w:t>
       </w:r>
     </w:p>
@@ -655,25 +495,17 @@
         <w:tabs>
           <w:tab w:pos="9072" w:val="right" w:leader="dot"/>
         </w:tabs>
-        <w:spacing w:after="40"/>
+        <w:spacing w:after="0"/>
         <w:ind w:left="360" w:firstLine="0"/>
       </w:pPr>
       <w:r>
         <w:rPr>
-          <w:rFonts w:ascii="Times New Roman" w:hAnsi="Times New Roman" w:eastAsia="Times New Roman"/>
+          <w:rFonts w:ascii="Times New Roman" w:hAnsi="Times New Roman"/>
           <w:b w:val="0"/>
           <w:sz w:val="22"/>
         </w:rPr>
         <w:t>3.4 Functional Module Design</w:t>
-      </w:r>
-      <w:r>
         <w:tab/>
-      </w:r>
-      <w:r>
-        <w:rPr>
-          <w:rFonts w:ascii="Times New Roman" w:hAnsi="Times New Roman" w:eastAsia="Times New Roman"/>
-          <w:sz w:val="22"/>
-        </w:rPr>
         <w:t>7</w:t>
       </w:r>
     </w:p>
@@ -682,25 +514,17 @@
         <w:tabs>
           <w:tab w:pos="9072" w:val="right" w:leader="dot"/>
         </w:tabs>
-        <w:spacing w:after="40"/>
+        <w:spacing w:after="0"/>
         <w:ind w:left="360" w:firstLine="0"/>
       </w:pPr>
       <w:r>
         <w:rPr>
-          <w:rFonts w:ascii="Times New Roman" w:hAnsi="Times New Roman" w:eastAsia="Times New Roman"/>
+          <w:rFonts w:ascii="Times New Roman" w:hAnsi="Times New Roman"/>
           <w:b w:val="0"/>
           <w:sz w:val="22"/>
         </w:rPr>
         <w:t>3.5 Booking, Availability, and Payment Logic</w:t>
-      </w:r>
-      <w:r>
         <w:tab/>
-      </w:r>
-      <w:r>
-        <w:rPr>
-          <w:rFonts w:ascii="Times New Roman" w:hAnsi="Times New Roman" w:eastAsia="Times New Roman"/>
-          <w:sz w:val="22"/>
-        </w:rPr>
         <w:t>8</w:t>
       </w:r>
     </w:p>
@@ -709,25 +533,17 @@
         <w:tabs>
           <w:tab w:pos="9072" w:val="right" w:leader="dot"/>
         </w:tabs>
-        <w:spacing w:after="40"/>
+        <w:spacing w:after="0"/>
         <w:ind w:left="720" w:firstLine="0"/>
       </w:pPr>
       <w:r>
         <w:rPr>
-          <w:rFonts w:ascii="Times New Roman" w:hAnsi="Times New Roman" w:eastAsia="Times New Roman"/>
+          <w:rFonts w:ascii="Times New Roman" w:hAnsi="Times New Roman"/>
           <w:b w:val="0"/>
           <w:sz w:val="20"/>
         </w:rPr>
         <w:t>3.5.1 Booking Hold and Availability Check</w:t>
-      </w:r>
-      <w:r>
         <w:tab/>
-      </w:r>
-      <w:r>
-        <w:rPr>
-          <w:rFonts w:ascii="Times New Roman" w:hAnsi="Times New Roman" w:eastAsia="Times New Roman"/>
-          <w:sz w:val="20"/>
-        </w:rPr>
         <w:t>8</w:t>
       </w:r>
     </w:p>
@@ -736,25 +552,17 @@
         <w:tabs>
           <w:tab w:pos="9072" w:val="right" w:leader="dot"/>
         </w:tabs>
-        <w:spacing w:after="40"/>
+        <w:spacing w:after="0"/>
         <w:ind w:left="720" w:firstLine="0"/>
       </w:pPr>
       <w:r>
         <w:rPr>
-          <w:rFonts w:ascii="Times New Roman" w:hAnsi="Times New Roman" w:eastAsia="Times New Roman"/>
+          <w:rFonts w:ascii="Times New Roman" w:hAnsi="Times New Roman"/>
           <w:b w:val="0"/>
           <w:sz w:val="20"/>
         </w:rPr>
         <w:t>3.5.2 Payment Confirmation and E-Ticket Generation</w:t>
-      </w:r>
-      <w:r>
         <w:tab/>
-      </w:r>
-      <w:r>
-        <w:rPr>
-          <w:rFonts w:ascii="Times New Roman" w:hAnsi="Times New Roman" w:eastAsia="Times New Roman"/>
-          <w:sz w:val="20"/>
-        </w:rPr>
         <w:t>8</w:t>
       </w:r>
     </w:p>
@@ -763,25 +571,17 @@
         <w:tabs>
           <w:tab w:pos="9072" w:val="right" w:leader="dot"/>
         </w:tabs>
-        <w:spacing w:after="40"/>
+        <w:spacing w:after="0"/>
         <w:ind w:left="720" w:firstLine="0"/>
       </w:pPr>
       <w:r>
         <w:rPr>
-          <w:rFonts w:ascii="Times New Roman" w:hAnsi="Times New Roman" w:eastAsia="Times New Roman"/>
+          <w:rFonts w:ascii="Times New Roman" w:hAnsi="Times New Roman"/>
           <w:b w:val="0"/>
           <w:sz w:val="20"/>
         </w:rPr>
         <w:t>3.5.3 Cancellation and Refund Handling</w:t>
-      </w:r>
-      <w:r>
         <w:tab/>
-      </w:r>
-      <w:r>
-        <w:rPr>
-          <w:rFonts w:ascii="Times New Roman" w:hAnsi="Times New Roman" w:eastAsia="Times New Roman"/>
-          <w:sz w:val="20"/>
-        </w:rPr>
         <w:t>8</w:t>
       </w:r>
     </w:p>
@@ -790,25 +590,17 @@
         <w:tabs>
           <w:tab w:pos="9072" w:val="right" w:leader="dot"/>
         </w:tabs>
-        <w:spacing w:after="40"/>
+        <w:spacing w:after="0"/>
         <w:ind w:left="360" w:firstLine="0"/>
       </w:pPr>
       <w:r>
         <w:rPr>
-          <w:rFonts w:ascii="Times New Roman" w:hAnsi="Times New Roman" w:eastAsia="Times New Roman"/>
+          <w:rFonts w:ascii="Times New Roman" w:hAnsi="Times New Roman"/>
           <w:b w:val="0"/>
           <w:sz w:val="22"/>
         </w:rPr>
         <w:t>3.6 Trust, Approval, and Moderation Workflow</w:t>
-      </w:r>
-      <w:r>
         <w:tab/>
-      </w:r>
-      <w:r>
-        <w:rPr>
-          <w:rFonts w:ascii="Times New Roman" w:hAnsi="Times New Roman" w:eastAsia="Times New Roman"/>
-          <w:sz w:val="22"/>
-        </w:rPr>
         <w:t>8</w:t>
       </w:r>
     </w:p>
@@ -817,25 +609,17 @@
         <w:tabs>
           <w:tab w:pos="9072" w:val="right" w:leader="dot"/>
         </w:tabs>
-        <w:spacing w:after="40"/>
+        <w:spacing w:after="0"/>
         <w:ind w:left="720" w:firstLine="0"/>
       </w:pPr>
       <w:r>
         <w:rPr>
-          <w:rFonts w:ascii="Times New Roman" w:hAnsi="Times New Roman" w:eastAsia="Times New Roman"/>
+          <w:rFonts w:ascii="Times New Roman" w:hAnsi="Times New Roman"/>
           <w:b w:val="0"/>
           <w:sz w:val="20"/>
         </w:rPr>
         <w:t>3.6.1 Partner Registration Review</w:t>
-      </w:r>
-      <w:r>
         <w:tab/>
-      </w:r>
-      <w:r>
-        <w:rPr>
-          <w:rFonts w:ascii="Times New Roman" w:hAnsi="Times New Roman" w:eastAsia="Times New Roman"/>
-          <w:sz w:val="20"/>
-        </w:rPr>
         <w:t>8</w:t>
       </w:r>
     </w:p>
@@ -844,25 +628,17 @@
         <w:tabs>
           <w:tab w:pos="9072" w:val="right" w:leader="dot"/>
         </w:tabs>
-        <w:spacing w:after="40"/>
+        <w:spacing w:after="0"/>
         <w:ind w:left="720" w:firstLine="0"/>
       </w:pPr>
       <w:r>
         <w:rPr>
-          <w:rFonts w:ascii="Times New Roman" w:hAnsi="Times New Roman" w:eastAsia="Times New Roman"/>
+          <w:rFonts w:ascii="Times New Roman" w:hAnsi="Times New Roman"/>
           <w:b w:val="0"/>
           <w:sz w:val="20"/>
         </w:rPr>
         <w:t>3.6.2 Attraction Listing Approval</w:t>
-      </w:r>
-      <w:r>
         <w:tab/>
-      </w:r>
-      <w:r>
-        <w:rPr>
-          <w:rFonts w:ascii="Times New Roman" w:hAnsi="Times New Roman" w:eastAsia="Times New Roman"/>
-          <w:sz w:val="20"/>
-        </w:rPr>
         <w:t>9</w:t>
       </w:r>
     </w:p>
@@ -871,25 +647,17 @@
         <w:tabs>
           <w:tab w:pos="9072" w:val="right" w:leader="dot"/>
         </w:tabs>
-        <w:spacing w:after="40"/>
+        <w:spacing w:after="0"/>
         <w:ind w:left="720" w:firstLine="0"/>
       </w:pPr>
       <w:r>
         <w:rPr>
-          <w:rFonts w:ascii="Times New Roman" w:hAnsi="Times New Roman" w:eastAsia="Times New Roman"/>
+          <w:rFonts w:ascii="Times New Roman" w:hAnsi="Times New Roman"/>
           <w:b w:val="0"/>
           <w:sz w:val="20"/>
         </w:rPr>
         <w:t>3.6.3 Review and Violation Moderation</w:t>
-      </w:r>
-      <w:r>
         <w:tab/>
-      </w:r>
-      <w:r>
-        <w:rPr>
-          <w:rFonts w:ascii="Times New Roman" w:hAnsi="Times New Roman" w:eastAsia="Times New Roman"/>
-          <w:sz w:val="20"/>
-        </w:rPr>
         <w:t>9</w:t>
       </w:r>
     </w:p>
@@ -898,25 +666,17 @@
         <w:tabs>
           <w:tab w:pos="9072" w:val="right" w:leader="dot"/>
         </w:tabs>
-        <w:spacing w:after="40"/>
+        <w:spacing w:after="0"/>
         <w:ind w:left="360" w:firstLine="0"/>
       </w:pPr>
       <w:r>
         <w:rPr>
-          <w:rFonts w:ascii="Times New Roman" w:hAnsi="Times New Roman" w:eastAsia="Times New Roman"/>
+          <w:rFonts w:ascii="Times New Roman" w:hAnsi="Times New Roman"/>
           <w:b w:val="0"/>
           <w:sz w:val="22"/>
         </w:rPr>
         <w:t>3.7 AI Travel Assistant Design</w:t>
-      </w:r>
-      <w:r>
         <w:tab/>
-      </w:r>
-      <w:r>
-        <w:rPr>
-          <w:rFonts w:ascii="Times New Roman" w:hAnsi="Times New Roman" w:eastAsia="Times New Roman"/>
-          <w:sz w:val="22"/>
-        </w:rPr>
         <w:t>9</w:t>
       </w:r>
     </w:p>
@@ -925,26 +685,56 @@
         <w:tabs>
           <w:tab w:pos="9072" w:val="right" w:leader="dot"/>
         </w:tabs>
-        <w:spacing w:after="40"/>
-        <w:ind w:left="0" w:firstLine="0"/>
+        <w:spacing w:after="0"/>
+        <w:ind w:left="360" w:firstLine="0"/>
       </w:pPr>
       <w:r>
         <w:rPr>
-          <w:rFonts w:ascii="Times New Roman" w:hAnsi="Times New Roman" w:eastAsia="Times New Roman"/>
+          <w:rFonts w:ascii="Times New Roman" w:hAnsi="Times New Roman"/>
+          <w:b w:val="0"/>
+          <w:sz w:val="22"/>
+        </w:rPr>
+        <w:t>3.8 Proposed System</w:t>
+        <w:tab/>
+        <w:t>9</w:t>
+      </w:r>
+    </w:p>
+    <w:p>
+      <w:pPr>
+        <w:tabs>
+          <w:tab w:pos="9072" w:val="right" w:leader="dot"/>
+        </w:tabs>
+        <w:spacing w:after="0"/>
+        <w:ind w:left="360" w:firstLine="0"/>
+      </w:pPr>
+      <w:r>
+        <w:rPr>
+          <w:rFonts w:ascii="Times New Roman" w:hAnsi="Times New Roman"/>
+          <w:b w:val="0"/>
+          <w:sz w:val="22"/>
+        </w:rPr>
+        <w:t>3.9 Method</w:t>
+        <w:tab/>
+        <w:t>10</w:t>
+      </w:r>
+    </w:p>
+    <w:p>
+      <w:pPr>
+        <w:tabs>
+          <w:tab w:pos="9072" w:val="right" w:leader="dot"/>
+        </w:tabs>
+        <w:spacing w:after="0"/>
+        <w:ind w:left="0" w:firstLine="0"/>
+      </w:pPr>
+      <w:r>
+        <w:rPr>
+          <w:rFonts w:ascii="Times New Roman" w:hAnsi="Times New Roman"/>
           <w:b/>
           <w:sz w:val="22"/>
         </w:rPr>
         <w:t>4. Use-Case Analysis and Requirement Evaluation</w:t>
-      </w:r>
-      <w:r>
         <w:tab/>
-      </w:r>
-      <w:r>
-        <w:rPr>
-          <w:rFonts w:ascii="Times New Roman" w:hAnsi="Times New Roman" w:eastAsia="Times New Roman"/>
-          <w:sz w:val="22"/>
-        </w:rPr>
-        <w:t>9</w:t>
+        <w:t>10</w:t>
       </w:r>
     </w:p>
     <w:p>
@@ -952,26 +742,18 @@
         <w:tabs>
           <w:tab w:pos="9072" w:val="right" w:leader="dot"/>
         </w:tabs>
-        <w:spacing w:after="40"/>
+        <w:spacing w:after="0"/>
         <w:ind w:left="360" w:firstLine="0"/>
       </w:pPr>
       <w:r>
         <w:rPr>
-          <w:rFonts w:ascii="Times New Roman" w:hAnsi="Times New Roman" w:eastAsia="Times New Roman"/>
+          <w:rFonts w:ascii="Times New Roman" w:hAnsi="Times New Roman"/>
           <w:b w:val="0"/>
           <w:sz w:val="22"/>
         </w:rPr>
         <w:t>4.1 Use-Case Scope Summary</w:t>
-      </w:r>
-      <w:r>
         <w:tab/>
-      </w:r>
-      <w:r>
-        <w:rPr>
-          <w:rFonts w:ascii="Times New Roman" w:hAnsi="Times New Roman" w:eastAsia="Times New Roman"/>
-          <w:sz w:val="22"/>
-        </w:rPr>
-        <w:t>9</w:t>
+        <w:t>10</w:t>
       </w:r>
     </w:p>
     <w:p>
@@ -979,26 +761,18 @@
         <w:tabs>
           <w:tab w:pos="9072" w:val="right" w:leader="dot"/>
         </w:tabs>
-        <w:spacing w:after="40"/>
+        <w:spacing w:after="0"/>
         <w:ind w:left="360" w:firstLine="0"/>
       </w:pPr>
       <w:r>
         <w:rPr>
-          <w:rFonts w:ascii="Times New Roman" w:hAnsi="Times New Roman" w:eastAsia="Times New Roman"/>
+          <w:rFonts w:ascii="Times New Roman" w:hAnsi="Times New Roman"/>
           <w:b w:val="0"/>
           <w:sz w:val="22"/>
         </w:rPr>
         <w:t>4.2 Functional Requirements</w:t>
-      </w:r>
-      <w:r>
         <w:tab/>
-      </w:r>
-      <w:r>
-        <w:rPr>
-          <w:rFonts w:ascii="Times New Roman" w:hAnsi="Times New Roman" w:eastAsia="Times New Roman"/>
-          <w:sz w:val="22"/>
-        </w:rPr>
-        <w:t>10</w:t>
+        <w:t>11</w:t>
       </w:r>
     </w:p>
     <w:p>
@@ -1006,26 +780,18 @@
         <w:tabs>
           <w:tab w:pos="9072" w:val="right" w:leader="dot"/>
         </w:tabs>
-        <w:spacing w:after="40"/>
+        <w:spacing w:after="0"/>
         <w:ind w:left="720" w:firstLine="0"/>
       </w:pPr>
       <w:r>
         <w:rPr>
-          <w:rFonts w:ascii="Times New Roman" w:hAnsi="Times New Roman" w:eastAsia="Times New Roman"/>
+          <w:rFonts w:ascii="Times New Roman" w:hAnsi="Times New Roman"/>
           <w:b w:val="0"/>
           <w:sz w:val="20"/>
         </w:rPr>
         <w:t>4.2.1 Customer-Facing Requirements</w:t>
-      </w:r>
-      <w:r>
         <w:tab/>
-      </w:r>
-      <w:r>
-        <w:rPr>
-          <w:rFonts w:ascii="Times New Roman" w:hAnsi="Times New Roman" w:eastAsia="Times New Roman"/>
-          <w:sz w:val="20"/>
-        </w:rPr>
-        <w:t>10</w:t>
+        <w:t>11</w:t>
       </w:r>
     </w:p>
     <w:p>
@@ -1033,26 +799,18 @@
         <w:tabs>
           <w:tab w:pos="9072" w:val="right" w:leader="dot"/>
         </w:tabs>
-        <w:spacing w:after="40"/>
+        <w:spacing w:after="0"/>
         <w:ind w:left="720" w:firstLine="0"/>
       </w:pPr>
       <w:r>
         <w:rPr>
-          <w:rFonts w:ascii="Times New Roman" w:hAnsi="Times New Roman" w:eastAsia="Times New Roman"/>
+          <w:rFonts w:ascii="Times New Roman" w:hAnsi="Times New Roman"/>
           <w:b w:val="0"/>
           <w:sz w:val="20"/>
         </w:rPr>
         <w:t>4.2.2 Partner and Administration Requirements</w:t>
-      </w:r>
-      <w:r>
         <w:tab/>
-      </w:r>
-      <w:r>
-        <w:rPr>
-          <w:rFonts w:ascii="Times New Roman" w:hAnsi="Times New Roman" w:eastAsia="Times New Roman"/>
-          <w:sz w:val="20"/>
-        </w:rPr>
-        <w:t>10</w:t>
+        <w:t>11</w:t>
       </w:r>
     </w:p>
     <w:p>
@@ -1060,26 +818,18 @@
         <w:tabs>
           <w:tab w:pos="9072" w:val="right" w:leader="dot"/>
         </w:tabs>
-        <w:spacing w:after="40"/>
+        <w:spacing w:after="0"/>
         <w:ind w:left="360" w:firstLine="0"/>
       </w:pPr>
       <w:r>
         <w:rPr>
-          <w:rFonts w:ascii="Times New Roman" w:hAnsi="Times New Roman" w:eastAsia="Times New Roman"/>
+          <w:rFonts w:ascii="Times New Roman" w:hAnsi="Times New Roman"/>
           <w:b w:val="0"/>
           <w:sz w:val="22"/>
         </w:rPr>
         <w:t>4.3 Non-Functional Requirements</w:t>
-      </w:r>
-      <w:r>
         <w:tab/>
-      </w:r>
-      <w:r>
-        <w:rPr>
-          <w:rFonts w:ascii="Times New Roman" w:hAnsi="Times New Roman" w:eastAsia="Times New Roman"/>
-          <w:sz w:val="22"/>
-        </w:rPr>
-        <w:t>11</w:t>
+        <w:t>12</w:t>
       </w:r>
     </w:p>
     <w:p>
@@ -1087,26 +837,18 @@
         <w:tabs>
           <w:tab w:pos="9072" w:val="right" w:leader="dot"/>
         </w:tabs>
-        <w:spacing w:after="40"/>
+        <w:spacing w:after="0"/>
         <w:ind w:left="360" w:firstLine="0"/>
       </w:pPr>
       <w:r>
         <w:rPr>
-          <w:rFonts w:ascii="Times New Roman" w:hAnsi="Times New Roman" w:eastAsia="Times New Roman"/>
+          <w:rFonts w:ascii="Times New Roman" w:hAnsi="Times New Roman"/>
           <w:b w:val="0"/>
           <w:sz w:val="22"/>
         </w:rPr>
         <w:t>4.4 Requirement Evaluation Against Related Work</w:t>
-      </w:r>
-      <w:r>
         <w:tab/>
-      </w:r>
-      <w:r>
-        <w:rPr>
-          <w:rFonts w:ascii="Times New Roman" w:hAnsi="Times New Roman" w:eastAsia="Times New Roman"/>
-          <w:sz w:val="22"/>
-        </w:rPr>
-        <w:t>11</w:t>
+        <w:t>12</w:t>
       </w:r>
     </w:p>
     <w:p>
@@ -1114,26 +856,18 @@
         <w:tabs>
           <w:tab w:pos="9072" w:val="right" w:leader="dot"/>
         </w:tabs>
-        <w:spacing w:after="40"/>
+        <w:spacing w:after="0"/>
         <w:ind w:left="360" w:firstLine="0"/>
       </w:pPr>
       <w:r>
         <w:rPr>
-          <w:rFonts w:ascii="Times New Roman" w:hAnsi="Times New Roman" w:eastAsia="Times New Roman"/>
+          <w:rFonts w:ascii="Times New Roman" w:hAnsi="Times New Roman"/>
           <w:b w:val="0"/>
           <w:sz w:val="22"/>
         </w:rPr>
         <w:t>4.5 Scope Boundary for SWR302</w:t>
-      </w:r>
-      <w:r>
         <w:tab/>
-      </w:r>
-      <w:r>
-        <w:rPr>
-          <w:rFonts w:ascii="Times New Roman" w:hAnsi="Times New Roman" w:eastAsia="Times New Roman"/>
-          <w:sz w:val="22"/>
-        </w:rPr>
-        <w:t>12</w:t>
+        <w:t>13</w:t>
       </w:r>
     </w:p>
     <w:p>
@@ -1141,26 +875,18 @@
         <w:tabs>
           <w:tab w:pos="9072" w:val="right" w:leader="dot"/>
         </w:tabs>
-        <w:spacing w:after="40"/>
+        <w:spacing w:after="0"/>
         <w:ind w:left="0" w:firstLine="0"/>
       </w:pPr>
       <w:r>
         <w:rPr>
-          <w:rFonts w:ascii="Times New Roman" w:hAnsi="Times New Roman" w:eastAsia="Times New Roman"/>
+          <w:rFonts w:ascii="Times New Roman" w:hAnsi="Times New Roman"/>
           <w:b/>
           <w:sz w:val="22"/>
         </w:rPr>
         <w:t>5. Limitations and Future Directions</w:t>
-      </w:r>
-      <w:r>
         <w:tab/>
-      </w:r>
-      <w:r>
-        <w:rPr>
-          <w:rFonts w:ascii="Times New Roman" w:hAnsi="Times New Roman" w:eastAsia="Times New Roman"/>
-          <w:sz w:val="22"/>
-        </w:rPr>
-        <w:t>12</w:t>
+        <w:t>13</w:t>
       </w:r>
     </w:p>
     <w:p>
@@ -1168,26 +894,18 @@
         <w:tabs>
           <w:tab w:pos="9072" w:val="right" w:leader="dot"/>
         </w:tabs>
-        <w:spacing w:after="40"/>
+        <w:spacing w:after="0"/>
         <w:ind w:left="0" w:firstLine="0"/>
       </w:pPr>
       <w:r>
         <w:rPr>
-          <w:rFonts w:ascii="Times New Roman" w:hAnsi="Times New Roman" w:eastAsia="Times New Roman"/>
+          <w:rFonts w:ascii="Times New Roman" w:hAnsi="Times New Roman"/>
           <w:b/>
           <w:sz w:val="22"/>
         </w:rPr>
         <w:t>6. Conclusion</w:t>
-      </w:r>
-      <w:r>
         <w:tab/>
-      </w:r>
-      <w:r>
-        <w:rPr>
-          <w:rFonts w:ascii="Times New Roman" w:hAnsi="Times New Roman" w:eastAsia="Times New Roman"/>
-          <w:sz w:val="22"/>
-        </w:rPr>
-        <w:t>12</w:t>
+        <w:t>13</w:t>
       </w:r>
     </w:p>
     <w:p>
@@ -1195,33 +913,25 @@
         <w:tabs>
           <w:tab w:pos="9072" w:val="right" w:leader="dot"/>
         </w:tabs>
-        <w:spacing w:after="40"/>
+        <w:spacing w:after="0"/>
         <w:ind w:left="0" w:firstLine="0"/>
       </w:pPr>
       <w:r>
         <w:rPr>
-          <w:rFonts w:ascii="Times New Roman" w:hAnsi="Times New Roman" w:eastAsia="Times New Roman"/>
+          <w:rFonts w:ascii="Times New Roman" w:hAnsi="Times New Roman"/>
           <w:b/>
           <w:sz w:val="22"/>
         </w:rPr>
         <w:t>References</w:t>
-      </w:r>
-      <w:r>
         <w:tab/>
-      </w:r>
-      <w:r>
-        <w:rPr>
-          <w:rFonts w:ascii="Times New Roman" w:hAnsi="Times New Roman" w:eastAsia="Times New Roman"/>
-          <w:sz w:val="22"/>
-        </w:rPr>
-        <w:t>13</w:t>
+        <w:t>14</w:t>
       </w:r>
     </w:p>
     <w:p>
       <w:pPr>
         <w:pStyle w:val="Heading1"/>
         <w:keepNext/>
-        <w:pageBreakBefore w:val="0"/>
+        <w:pageBreakBefore/>
         <w:spacing w:before="200" w:after="120"/>
       </w:pPr>
       <w:r>
@@ -2960,6 +2670,58 @@
           <w:sz w:val="24"/>
         </w:rPr>
         <w:t>The AI module supports two main use cases: Get AI Attraction Suggestions and Chat with AI Travel Assistant. Suggested outputs may include attraction categories, reasons for recommendation, estimated suitability, and reminders to check ticket availability and policies before payment. The AI Service does not approve partners, change ticket prices, confirm payments, or override support decisions.</w:t>
+      </w:r>
+    </w:p>
+    <w:p>
+      <w:pPr>
+        <w:pStyle w:val="Heading2"/>
+      </w:pPr>
+      <w:r>
+        <w:t>3.8 Proposed System</w:t>
+      </w:r>
+    </w:p>
+    <w:p>
+      <w:pPr/>
+      <w:r>
+        <w:t>The proposed system is VietTicket Travel, a web-based travel attraction ticket booking platform for smart tourism services in Vietnam. The system is designed to connect Guests, Customers, Partners, Support Staff, Administrators, and external services within one controlled booking ecosystem. Its main purpose is to transform fragmented attraction-ticket information into a structured workflow in which partners submit attraction and ticket information, administrators review the submitted content, customers book only approved attractions, the payment gateway confirms transaction results, and the system issues e-tickets/QR only after successful payment confirmation.</w:t>
+      </w:r>
+    </w:p>
+    <w:p>
+      <w:pPr/>
+      <w:r>
+        <w:t>The proposal does not expand into hotel booking, airline booking, transportation services, full tour-package operation, or physical gate-control hardware. Instead, it focuses on the core attraction-ticketing flow that can be clearly modeled, tested, and defended in SWR302. This limited scope supports requirement consistency because each actor has a specific responsibility and each major function can be traced to a business need: discovery, partner submission, approval, ticket product configuration, booking, online payment, refund support, review moderation, notification, and AI-assisted attraction suggestion.</w:t>
+      </w:r>
+    </w:p>
+    <w:p>
+      <w:pPr/>
+      <w:r>
+        <w:t>The system is proposed with four requirement-oriented design decisions. First, role-based access control separates customer, partner, support, and administrator permissions to reduce unauthorized operations. Second, the ticket inventory and time-slot model checks availability before booking and helps reduce overselling risk. Third, booking status, payment status, confirmation status, and refund status are separated so that payment failure, successful confirmation, cancellation, and refund handling can be tracked without corrupting booking data. Fourth, the AI Travel Assistant is bounded to approved platform data and customer-provided preferences; therefore, it supports attraction discovery without replacing administrator approval, payment processing, or support-staff decisions.</w:t>
+      </w:r>
+    </w:p>
+    <w:p>
+      <w:pPr>
+        <w:pStyle w:val="Heading2"/>
+      </w:pPr>
+      <w:r>
+        <w:t>3.9 Method</w:t>
+      </w:r>
+    </w:p>
+    <w:p>
+      <w:pPr/>
+      <w:r>
+        <w:t>The method used in this report is a software requirements engineering method, not a production deployment experiment. The report develops the VietTicket Travel requirement model through literature grounding, scope definition, actor analysis, functional decomposition, state-based workflow design, requirement specification, and requirement evaluation. This method is appropriate for SWR302 because the main goal is to produce a clear, traceable, and defendable set of software requirements rather than to prove real-market performance.</w:t>
+      </w:r>
+    </w:p>
+    <w:p>
+      <w:pPr/>
+      <w:r>
+        <w:t>First, related work is used to identify requirement concerns in smart tourism, tourism recommender systems, online booking trust, payment methods, and digital tourism experience enhancement. Second, the project boundary is defined by narrowing the platform to attraction-ticket booking and excluding unrelated tourism services. Third, actors and external services are identified from the intermediary-platform workflow, including Guest, Customer, Partner, Support Staff, Administrator, Payment Gateway, Notification Service, and AI Service. Fourth, use cases are grouped into functional modules so that each business activity can be converted into functional requirements and non-functional requirements.</w:t>
+      </w:r>
+    </w:p>
+    <w:p>
+      <w:pPr/>
+      <w:r>
+        <w:t>Fifth, the booking, availability, payment, cancellation, and refund flows are described using separated status states to support reliability and auditability. Sixth, the proposed requirements are evaluated against the related work to check whether the design responds to the literature-supported issues of trust, information quality, personalized discovery, payment-state management, and future digital experience enhancement. The method does not claim that the platform has already been deployed or empirically measured. Its validation is based on scope clarity, actor responsibility, requirement traceability, consistency between modules, and alignment with the referenced tourism-technology studies.</w:t>
       </w:r>
     </w:p>
     <w:p>

</xml_diff>